<commit_message>
Add PracticeExercise04 - Student Transcript and Filter Search List exercises
</commit_message>
<xml_diff>
--- a/PracticeExercise2/Phiếu học tập CSS - BTTH02 - K66 .docx
+++ b/PracticeExercise2/Phiếu học tập CSS - BTTH02 - K66 .docx
@@ -11,8 +11,6 @@
           <w:szCs w:val="24"/>
         </w:rPr>
       </w:pPr>
-      <w:bookmarkStart w:id="56" w:name="_GoBack"/>
-      <w:bookmarkEnd w:id="56"/>
       <w:r>
         <w:rPr>
           <w:rFonts w:hint="default" w:ascii="Times New Roman" w:hAnsi="Times New Roman" w:cs="Times New Roman"/>
@@ -7502,9 +7500,9 @@
         </w:tblCellMar>
       </w:tblPr>
       <w:tblGrid>
-        <w:gridCol w:w="2086"/>
-        <w:gridCol w:w="3344"/>
-        <w:gridCol w:w="3349"/>
+        <w:gridCol w:w="1697"/>
+        <w:gridCol w:w="3858"/>
+        <w:gridCol w:w="4285"/>
       </w:tblGrid>
       <w:tr>
         <w:tblPrEx>
@@ -7686,17 +7684,17 @@
                 <w:rFonts w:hint="default" w:ascii="Times New Roman" w:hAnsi="Times New Roman" w:cs="Times New Roman"/>
                 <w:sz w:val="24"/>
                 <w:szCs w:val="24"/>
+                <w:lang w:val="vi-VN"/>
               </w:rPr>
             </w:pPr>
             <w:r>
               <w:rPr>
-                <w:rFonts w:hint="default" w:ascii="Times New Roman" w:hAnsi="Times New Roman" w:eastAsia="inter" w:cs="Times New Roman"/>
-                <w:i/>
-                <w:color w:val="000000"/>
-                <w:sz w:val="24"/>
-                <w:szCs w:val="24"/>
-              </w:rPr>
-              <w:t>(Tự điền: 1 chiều hay 2 chiều?)</w:t>
+                <w:rFonts w:hint="default" w:ascii="Times New Roman" w:hAnsi="Times New Roman" w:cs="Times New Roman"/>
+                <w:sz w:val="24"/>
+                <w:szCs w:val="24"/>
+                <w:lang w:val="vi-VN"/>
+              </w:rPr>
+              <w:t>1 chiều</w:t>
             </w:r>
           </w:p>
         </w:tc>
@@ -7715,17 +7713,17 @@
                 <w:rFonts w:hint="default" w:ascii="Times New Roman" w:hAnsi="Times New Roman" w:cs="Times New Roman"/>
                 <w:sz w:val="24"/>
                 <w:szCs w:val="24"/>
+                <w:lang w:val="vi-VN"/>
               </w:rPr>
             </w:pPr>
             <w:r>
               <w:rPr>
-                <w:rFonts w:hint="default" w:ascii="Times New Roman" w:hAnsi="Times New Roman" w:eastAsia="inter" w:cs="Times New Roman"/>
-                <w:i/>
-                <w:color w:val="000000"/>
-                <w:sz w:val="24"/>
-                <w:szCs w:val="24"/>
-              </w:rPr>
-              <w:t>(Tự điền: 1 chiều hay 2 chiều?)</w:t>
+                <w:rFonts w:hint="default" w:ascii="Times New Roman" w:hAnsi="Times New Roman" w:cs="Times New Roman"/>
+                <w:sz w:val="24"/>
+                <w:szCs w:val="24"/>
+                <w:lang w:val="vi-VN"/>
+              </w:rPr>
+              <w:t>2 chiều</w:t>
             </w:r>
           </w:p>
         </w:tc>
@@ -7802,13 +7800,11 @@
             </w:pPr>
             <w:r>
               <w:rPr>
-                <w:rFonts w:hint="default" w:ascii="Times New Roman" w:hAnsi="Times New Roman" w:eastAsia="inter" w:cs="Times New Roman"/>
-                <w:i/>
-                <w:color w:val="000000"/>
-                <w:sz w:val="24"/>
-                <w:szCs w:val="24"/>
-              </w:rPr>
-              <w:t>(Tự điền)</w:t>
+                <w:rFonts w:hint="default" w:ascii="Times New Roman" w:hAnsi="Times New Roman" w:eastAsia="SimSun" w:cs="Times New Roman"/>
+                <w:sz w:val="24"/>
+                <w:szCs w:val="24"/>
+              </w:rPr>
+              <w:t>Sắp xếp các thành phần bên trong (menu, nút, icon).</w:t>
             </w:r>
           </w:p>
         </w:tc>
@@ -7831,13 +7827,11 @@
             </w:pPr>
             <w:r>
               <w:rPr>
-                <w:rFonts w:hint="default" w:ascii="Times New Roman" w:hAnsi="Times New Roman" w:eastAsia="inter" w:cs="Times New Roman"/>
-                <w:i/>
-                <w:color w:val="000000"/>
-                <w:sz w:val="24"/>
-                <w:szCs w:val="24"/>
-              </w:rPr>
-              <w:t>(Tự điền)</w:t>
+                <w:rFonts w:hint="default" w:ascii="Times New Roman" w:hAnsi="Times New Roman" w:eastAsia="SimSun" w:cs="Times New Roman"/>
+                <w:sz w:val="24"/>
+                <w:szCs w:val="24"/>
+              </w:rPr>
+              <w:t>Xây dựng cấu trúc tổng thể của trang web</w:t>
             </w:r>
           </w:p>
         </w:tc>
@@ -8112,13 +8106,11 @@
             </w:pPr>
             <w:r>
               <w:rPr>
-                <w:rFonts w:hint="default" w:ascii="Times New Roman" w:hAnsi="Times New Roman" w:eastAsia="inter" w:cs="Times New Roman"/>
-                <w:i/>
-                <w:color w:val="000000"/>
-                <w:sz w:val="24"/>
-                <w:szCs w:val="24"/>
-              </w:rPr>
-              <w:t>(Tự điền)</w:t>
+                <w:rFonts w:hint="default" w:ascii="Times New Roman" w:hAnsi="Times New Roman" w:eastAsia="SimSun" w:cs="Times New Roman"/>
+                <w:sz w:val="24"/>
+                <w:szCs w:val="24"/>
+              </w:rPr>
+              <w:t>Thanh điều hướng, căn giữa một phần tử.</w:t>
             </w:r>
           </w:p>
         </w:tc>
@@ -8141,13 +8133,11 @@
             </w:pPr>
             <w:r>
               <w:rPr>
-                <w:rFonts w:hint="default" w:ascii="Times New Roman" w:hAnsi="Times New Roman" w:eastAsia="inter" w:cs="Times New Roman"/>
-                <w:i/>
-                <w:color w:val="000000"/>
-                <w:sz w:val="24"/>
-                <w:szCs w:val="24"/>
-              </w:rPr>
-              <w:t>(Tự điền)</w:t>
+                <w:rFonts w:hint="default" w:ascii="Times New Roman" w:hAnsi="Times New Roman" w:eastAsia="SimSun" w:cs="Times New Roman"/>
+                <w:sz w:val="24"/>
+                <w:szCs w:val="24"/>
+              </w:rPr>
+              <w:t>Chia bố cục trang web (Header, Sidebar, Content, Footer).</w:t>
             </w:r>
           </w:p>
         </w:tc>
@@ -8283,7 +8273,7 @@
           <w:sz w:val="24"/>
           <w:szCs w:val="24"/>
         </w:rPr>
-        <w:t xml:space="preserve">    justify-content: ___________; /* flex-start | center | space-between | space-around */</w:t>
+        <w:t xml:space="preserve">    justify-content: space-between; /* flex-start | center | space-between | space-around */</w:t>
       </w:r>
       <w:r>
         <w:rPr>
@@ -8343,7 +8333,7 @@
           <w:sz w:val="24"/>
           <w:szCs w:val="24"/>
         </w:rPr>
-        <w:t xml:space="preserve">    align-items: ___________; /* flex-start | center | flex-end | stretch */</w:t>
+        <w:t xml:space="preserve">    align-items:  center; /* flex-start | center | flex-end | stretch */</w:t>
       </w:r>
       <w:r>
         <w:rPr>
@@ -8403,7 +8393,7 @@
           <w:sz w:val="24"/>
           <w:szCs w:val="24"/>
         </w:rPr>
-        <w:t xml:space="preserve">    flex-wrap: ___________; /* nowrap | wrap */</w:t>
+        <w:t xml:space="preserve">    flex-wrap: wrap; /* nowrap | wrap */</w:t>
       </w:r>
       <w:r>
         <w:rPr>
@@ -8463,7 +8453,28 @@
           <w:sz w:val="24"/>
           <w:szCs w:val="24"/>
         </w:rPr>
-        <w:t xml:space="preserve">    gap: ___________;</w:t>
+        <w:t xml:space="preserve">    gap: </w:t>
+      </w:r>
+      <w:r>
+        <w:rPr>
+          <w:rStyle w:val="9"/>
+          <w:rFonts w:hint="default" w:ascii="Times New Roman" w:hAnsi="Times New Roman" w:eastAsia="IBM Plex Mono" w:cs="Times New Roman"/>
+          <w:color w:val="000000"/>
+          <w:sz w:val="24"/>
+          <w:szCs w:val="24"/>
+          <w:lang w:val="vi-VN"/>
+        </w:rPr>
+        <w:t>23px</w:t>
+      </w:r>
+      <w:r>
+        <w:rPr>
+          <w:rStyle w:val="9"/>
+          <w:rFonts w:hint="default" w:ascii="Times New Roman" w:hAnsi="Times New Roman" w:eastAsia="IBM Plex Mono" w:cs="Times New Roman"/>
+          <w:color w:val="000000"/>
+          <w:sz w:val="24"/>
+          <w:szCs w:val="24"/>
+        </w:rPr>
+        <w:t>;</w:t>
       </w:r>
       <w:r>
         <w:rPr>
@@ -8617,7 +8628,7 @@
           <w:sz w:val="24"/>
           <w:szCs w:val="24"/>
         </w:rPr>
-        <w:t xml:space="preserve">    grid-template-columns: ___________; /* repeat(3, 1fr) | 200px 1fr 2fr */</w:t>
+        <w:t xml:space="preserve">    grid-template-columns: repeat(3, 1fr); /* repeat(3, 1fr) | 200px 1fr 2fr */</w:t>
       </w:r>
       <w:r>
         <w:rPr>
@@ -8677,7 +8688,28 @@
           <w:sz w:val="24"/>
           <w:szCs w:val="24"/>
         </w:rPr>
-        <w:t xml:space="preserve">    grid-template-rows: ___________;</w:t>
+        <w:t xml:space="preserve">    grid-template-rows: </w:t>
+      </w:r>
+      <w:r>
+        <w:rPr>
+          <w:rStyle w:val="9"/>
+          <w:rFonts w:hint="default" w:ascii="Times New Roman" w:hAnsi="Times New Roman" w:eastAsia="IBM Plex Mono" w:cs="Times New Roman"/>
+          <w:color w:val="000000"/>
+          <w:sz w:val="24"/>
+          <w:szCs w:val="24"/>
+          <w:lang w:val="vi-VN"/>
+        </w:rPr>
+        <w:t>99px auto</w:t>
+      </w:r>
+      <w:r>
+        <w:rPr>
+          <w:rStyle w:val="9"/>
+          <w:rFonts w:hint="default" w:ascii="Times New Roman" w:hAnsi="Times New Roman" w:eastAsia="IBM Plex Mono" w:cs="Times New Roman"/>
+          <w:color w:val="000000"/>
+          <w:sz w:val="24"/>
+          <w:szCs w:val="24"/>
+        </w:rPr>
+        <w:t>;</w:t>
       </w:r>
       <w:r>
         <w:rPr>
@@ -8737,7 +8769,28 @@
           <w:sz w:val="24"/>
           <w:szCs w:val="24"/>
         </w:rPr>
-        <w:t xml:space="preserve">    gap: ___________;</w:t>
+        <w:t xml:space="preserve">    gap: </w:t>
+      </w:r>
+      <w:r>
+        <w:rPr>
+          <w:rStyle w:val="9"/>
+          <w:rFonts w:hint="default" w:ascii="Times New Roman" w:hAnsi="Times New Roman" w:eastAsia="IBM Plex Mono" w:cs="Times New Roman"/>
+          <w:color w:val="000000"/>
+          <w:sz w:val="24"/>
+          <w:szCs w:val="24"/>
+          <w:lang w:val="vi-VN"/>
+        </w:rPr>
+        <w:t>19px</w:t>
+      </w:r>
+      <w:r>
+        <w:rPr>
+          <w:rStyle w:val="9"/>
+          <w:rFonts w:hint="default" w:ascii="Times New Roman" w:hAnsi="Times New Roman" w:eastAsia="IBM Plex Mono" w:cs="Times New Roman"/>
+          <w:color w:val="000000"/>
+          <w:sz w:val="24"/>
+          <w:szCs w:val="24"/>
+        </w:rPr>
+        <w:t>;</w:t>
       </w:r>
       <w:r>
         <w:rPr>
@@ -9879,33 +9932,99 @@
         </w:rPr>
       </w:pPr>
       <w:r>
-        <w:rPr>
-          <w:rFonts w:hint="default" w:ascii="Times New Roman" w:hAnsi="Times New Roman" w:eastAsia="inter" w:cs="Times New Roman"/>
-          <w:i/>
-          <w:color w:val="000000"/>
-          <w:sz w:val="24"/>
-          <w:szCs w:val="24"/>
-        </w:rPr>
-        <w:t>(Dán ảnh 1: Desktop view - 3 card ngang)</w:t>
-      </w:r>
-      <w:r>
-        <w:rPr>
-          <w:rFonts w:hint="default" w:ascii="Times New Roman" w:hAnsi="Times New Roman" w:eastAsia="inter" w:cs="Times New Roman"/>
-          <w:color w:val="000000"/>
-          <w:sz w:val="24"/>
-          <w:szCs w:val="24"/>
-        </w:rPr>
-        <w:br w:type="textWrapping"/>
-      </w:r>
-      <w:r>
-        <w:rPr>
-          <w:rFonts w:hint="default" w:ascii="Times New Roman" w:hAnsi="Times New Roman" w:eastAsia="inter" w:cs="Times New Roman"/>
-          <w:i/>
-          <w:color w:val="000000"/>
-          <w:sz w:val="24"/>
-          <w:szCs w:val="24"/>
-        </w:rPr>
-        <w:t>(Dán ảnh 2: Mobile view - card xếp dọc)</w:t>
+        <w:drawing>
+          <wp:inline distT="0" distB="0" distL="114300" distR="114300">
+            <wp:extent cx="6036945" cy="3394075"/>
+            <wp:effectExtent l="0" t="0" r="1905" b="15875"/>
+            <wp:docPr id="3" name="Picture 1"/>
+            <wp:cNvGraphicFramePr>
+              <a:graphicFrameLocks xmlns:a="http://schemas.openxmlformats.org/drawingml/2006/main" noChangeAspect="1"/>
+            </wp:cNvGraphicFramePr>
+            <a:graphic xmlns:a="http://schemas.openxmlformats.org/drawingml/2006/main">
+              <a:graphicData uri="http://schemas.openxmlformats.org/drawingml/2006/picture">
+                <pic:pic xmlns:pic="http://schemas.openxmlformats.org/drawingml/2006/picture">
+                  <pic:nvPicPr>
+                    <pic:cNvPr id="3" name="Picture 1"/>
+                    <pic:cNvPicPr>
+                      <a:picLocks noChangeAspect="1"/>
+                    </pic:cNvPicPr>
+                  </pic:nvPicPr>
+                  <pic:blipFill>
+                    <a:blip r:embed="rId10"/>
+                    <a:stretch>
+                      <a:fillRect/>
+                    </a:stretch>
+                  </pic:blipFill>
+                  <pic:spPr>
+                    <a:xfrm>
+                      <a:off x="0" y="0"/>
+                      <a:ext cx="6036945" cy="3394075"/>
+                    </a:xfrm>
+                    <a:prstGeom prst="rect">
+                      <a:avLst/>
+                    </a:prstGeom>
+                    <a:noFill/>
+                    <a:ln>
+                      <a:noFill/>
+                    </a:ln>
+                  </pic:spPr>
+                </pic:pic>
+              </a:graphicData>
+            </a:graphic>
+          </wp:inline>
+        </w:drawing>
+      </w:r>
+      <w:r>
+        <w:rPr>
+          <w:rFonts w:hint="default" w:ascii="Times New Roman" w:hAnsi="Times New Roman" w:eastAsia="inter" w:cs="Times New Roman"/>
+          <w:color w:val="000000"/>
+          <w:sz w:val="24"/>
+          <w:szCs w:val="24"/>
+        </w:rPr>
+        <w:br w:type="textWrapping"/>
+      </w:r>
+      <w:r>
+        <w:drawing>
+          <wp:inline distT="0" distB="0" distL="114300" distR="114300">
+            <wp:extent cx="6036945" cy="3394075"/>
+            <wp:effectExtent l="0" t="0" r="1905" b="15875"/>
+            <wp:docPr id="5" name="Picture 3"/>
+            <wp:cNvGraphicFramePr>
+              <a:graphicFrameLocks xmlns:a="http://schemas.openxmlformats.org/drawingml/2006/main" noChangeAspect="1"/>
+            </wp:cNvGraphicFramePr>
+            <a:graphic xmlns:a="http://schemas.openxmlformats.org/drawingml/2006/main">
+              <a:graphicData uri="http://schemas.openxmlformats.org/drawingml/2006/picture">
+                <pic:pic xmlns:pic="http://schemas.openxmlformats.org/drawingml/2006/picture">
+                  <pic:nvPicPr>
+                    <pic:cNvPr id="5" name="Picture 3"/>
+                    <pic:cNvPicPr>
+                      <a:picLocks noChangeAspect="1"/>
+                    </pic:cNvPicPr>
+                  </pic:nvPicPr>
+                  <pic:blipFill>
+                    <a:blip r:embed="rId11"/>
+                    <a:stretch>
+                      <a:fillRect/>
+                    </a:stretch>
+                  </pic:blipFill>
+                  <pic:spPr>
+                    <a:xfrm>
+                      <a:off x="0" y="0"/>
+                      <a:ext cx="6036945" cy="3394075"/>
+                    </a:xfrm>
+                    <a:prstGeom prst="rect">
+                      <a:avLst/>
+                    </a:prstGeom>
+                    <a:noFill/>
+                    <a:ln>
+                      <a:noFill/>
+                    </a:ln>
+                  </pic:spPr>
+                </pic:pic>
+              </a:graphicData>
+            </a:graphic>
+          </wp:inline>
+        </w:drawing>
       </w:r>
     </w:p>
     <w:p>
@@ -11086,33 +11205,99 @@
         </w:rPr>
       </w:pPr>
       <w:r>
-        <w:rPr>
-          <w:rFonts w:hint="default" w:ascii="Times New Roman" w:hAnsi="Times New Roman" w:eastAsia="inter" w:cs="Times New Roman"/>
-          <w:i/>
-          <w:color w:val="000000"/>
-          <w:sz w:val="24"/>
-          <w:szCs w:val="24"/>
-        </w:rPr>
-        <w:t>(Dán ảnh 1: Desktop - 3 cột)</w:t>
-      </w:r>
-      <w:r>
-        <w:rPr>
-          <w:rFonts w:hint="default" w:ascii="Times New Roman" w:hAnsi="Times New Roman" w:eastAsia="inter" w:cs="Times New Roman"/>
-          <w:color w:val="000000"/>
-          <w:sz w:val="24"/>
-          <w:szCs w:val="24"/>
-        </w:rPr>
-        <w:br w:type="textWrapping"/>
-      </w:r>
-      <w:r>
-        <w:rPr>
-          <w:rFonts w:hint="default" w:ascii="Times New Roman" w:hAnsi="Times New Roman" w:eastAsia="inter" w:cs="Times New Roman"/>
-          <w:i/>
-          <w:color w:val="000000"/>
-          <w:sz w:val="24"/>
-          <w:szCs w:val="24"/>
-        </w:rPr>
-        <w:t>(Dán ảnh 2: Mobile - 1 cột)</w:t>
+        <w:drawing>
+          <wp:inline distT="0" distB="0" distL="114300" distR="114300">
+            <wp:extent cx="6036945" cy="3394075"/>
+            <wp:effectExtent l="0" t="0" r="1905" b="15875"/>
+            <wp:docPr id="8" name="Picture 4"/>
+            <wp:cNvGraphicFramePr>
+              <a:graphicFrameLocks xmlns:a="http://schemas.openxmlformats.org/drawingml/2006/main" noChangeAspect="1"/>
+            </wp:cNvGraphicFramePr>
+            <a:graphic xmlns:a="http://schemas.openxmlformats.org/drawingml/2006/main">
+              <a:graphicData uri="http://schemas.openxmlformats.org/drawingml/2006/picture">
+                <pic:pic xmlns:pic="http://schemas.openxmlformats.org/drawingml/2006/picture">
+                  <pic:nvPicPr>
+                    <pic:cNvPr id="8" name="Picture 4"/>
+                    <pic:cNvPicPr>
+                      <a:picLocks noChangeAspect="1"/>
+                    </pic:cNvPicPr>
+                  </pic:nvPicPr>
+                  <pic:blipFill>
+                    <a:blip r:embed="rId12"/>
+                    <a:stretch>
+                      <a:fillRect/>
+                    </a:stretch>
+                  </pic:blipFill>
+                  <pic:spPr>
+                    <a:xfrm>
+                      <a:off x="0" y="0"/>
+                      <a:ext cx="6036945" cy="3394075"/>
+                    </a:xfrm>
+                    <a:prstGeom prst="rect">
+                      <a:avLst/>
+                    </a:prstGeom>
+                    <a:noFill/>
+                    <a:ln>
+                      <a:noFill/>
+                    </a:ln>
+                  </pic:spPr>
+                </pic:pic>
+              </a:graphicData>
+            </a:graphic>
+          </wp:inline>
+        </w:drawing>
+      </w:r>
+      <w:r>
+        <w:rPr>
+          <w:rFonts w:hint="default" w:ascii="Times New Roman" w:hAnsi="Times New Roman" w:eastAsia="inter" w:cs="Times New Roman"/>
+          <w:color w:val="000000"/>
+          <w:sz w:val="24"/>
+          <w:szCs w:val="24"/>
+        </w:rPr>
+        <w:br w:type="textWrapping"/>
+      </w:r>
+      <w:r>
+        <w:drawing>
+          <wp:inline distT="0" distB="0" distL="114300" distR="114300">
+            <wp:extent cx="6036945" cy="3394075"/>
+            <wp:effectExtent l="0" t="0" r="1905" b="15875"/>
+            <wp:docPr id="9" name="Picture 5"/>
+            <wp:cNvGraphicFramePr>
+              <a:graphicFrameLocks xmlns:a="http://schemas.openxmlformats.org/drawingml/2006/main" noChangeAspect="1"/>
+            </wp:cNvGraphicFramePr>
+            <a:graphic xmlns:a="http://schemas.openxmlformats.org/drawingml/2006/main">
+              <a:graphicData uri="http://schemas.openxmlformats.org/drawingml/2006/picture">
+                <pic:pic xmlns:pic="http://schemas.openxmlformats.org/drawingml/2006/picture">
+                  <pic:nvPicPr>
+                    <pic:cNvPr id="9" name="Picture 5"/>
+                    <pic:cNvPicPr>
+                      <a:picLocks noChangeAspect="1"/>
+                    </pic:cNvPicPr>
+                  </pic:nvPicPr>
+                  <pic:blipFill>
+                    <a:blip r:embed="rId13"/>
+                    <a:stretch>
+                      <a:fillRect/>
+                    </a:stretch>
+                  </pic:blipFill>
+                  <pic:spPr>
+                    <a:xfrm>
+                      <a:off x="0" y="0"/>
+                      <a:ext cx="6036945" cy="3394075"/>
+                    </a:xfrm>
+                    <a:prstGeom prst="rect">
+                      <a:avLst/>
+                    </a:prstGeom>
+                    <a:noFill/>
+                    <a:ln>
+                      <a:noFill/>
+                    </a:ln>
+                  </pic:spPr>
+                </pic:pic>
+              </a:graphicData>
+            </a:graphic>
+          </wp:inline>
+        </w:drawing>
       </w:r>
     </w:p>
     <w:p>
@@ -11124,6 +11309,8 @@
           <w:szCs w:val="24"/>
         </w:rPr>
       </w:pPr>
+      <w:bookmarkStart w:id="56" w:name="_GoBack"/>
+      <w:bookmarkEnd w:id="56"/>
       <w:r>
         <w:rPr>
           <w:rFonts w:hint="default" w:ascii="Times New Roman" w:hAnsi="Times New Roman" w:cs="Times New Roman"/>
@@ -17448,7 +17635,7 @@
     <w:lsdException w:uiPriority="99" w:name="Body Text Indent 2"/>
     <w:lsdException w:uiPriority="99" w:name="Body Text Indent 3"/>
     <w:lsdException w:uiPriority="99" w:name="Block Text"/>
-    <w:lsdException w:uiPriority="99" w:name="Hyperlink"/>
+    <w:lsdException w:qFormat="1" w:uiPriority="99" w:name="Hyperlink"/>
     <w:lsdException w:uiPriority="99" w:name="FollowedHyperlink"/>
     <w:lsdException w:qFormat="1" w:unhideWhenUsed="0" w:uiPriority="22" w:semiHidden="0" w:name="Strong"/>
     <w:lsdException w:qFormat="1" w:unhideWhenUsed="0" w:uiPriority="20" w:semiHidden="0" w:name="Emphasis"/>
@@ -17675,6 +17862,7 @@
     <w:basedOn w:val="2"/>
     <w:semiHidden/>
     <w:unhideWhenUsed/>
+    <w:qFormat/>
     <w:uiPriority w:val="99"/>
     <w:rPr>
       <w:color w:val="0000FF"/>

</xml_diff>